<commit_message>
add other jenis bencana and change render word
</commit_message>
<xml_diff>
--- a/templates/template_ba_logistik_core.docx
+++ b/templates/template_ba_logistik_core.docx
@@ -424,6 +424,7 @@
         </w:rPr>
         <w:t xml:space="preserve">pada hari </w:t>
       </w:r>
+      <w:proofErr w:type="gramStart"/>
       <w:r>
         <w:rPr>
           <w:rFonts w:ascii="Times New Roman" w:eastAsia="Times New Roman" w:hAnsi="Times New Roman"/>
@@ -431,14 +432,24 @@
           <w:sz w:val="24"/>
           <w:szCs w:val="24"/>
         </w:rPr>
-        <w:t>{{ hari }}</w:t>
-      </w:r>
+        <w:t>{{ hari</w:t>
+      </w:r>
+      <w:proofErr w:type="gramEnd"/>
       <w:r>
         <w:rPr>
           <w:rFonts w:ascii="Times New Roman" w:eastAsia="Times New Roman" w:hAnsi="Times New Roman"/>
           <w:i/>
           <w:sz w:val="24"/>
           <w:szCs w:val="24"/>
+        </w:rPr>
+        <w:t xml:space="preserve"> }}</w:t>
+      </w:r>
+      <w:r>
+        <w:rPr>
+          <w:rFonts w:ascii="Times New Roman" w:eastAsia="Times New Roman" w:hAnsi="Times New Roman"/>
+          <w:i/>
+          <w:sz w:val="24"/>
+          <w:szCs w:val="24"/>
           <w:lang w:val="en-US"/>
         </w:rPr>
         <w:t xml:space="preserve"> </w:t>
@@ -458,7 +469,27 @@
           <w:sz w:val="24"/>
           <w:szCs w:val="24"/>
         </w:rPr>
-        <w:t xml:space="preserve"> {{ tanggal }} </w:t>
+        <w:t xml:space="preserve"> </w:t>
+      </w:r>
+      <w:proofErr w:type="gramStart"/>
+      <w:r>
+        <w:rPr>
+          <w:rFonts w:ascii="Times New Roman" w:eastAsia="Times New Roman" w:hAnsi="Times New Roman"/>
+          <w:i/>
+          <w:sz w:val="24"/>
+          <w:szCs w:val="24"/>
+        </w:rPr>
+        <w:t>{{ tanggal</w:t>
+      </w:r>
+      <w:proofErr w:type="gramEnd"/>
+      <w:r>
+        <w:rPr>
+          <w:rFonts w:ascii="Times New Roman" w:eastAsia="Times New Roman" w:hAnsi="Times New Roman"/>
+          <w:i/>
+          <w:sz w:val="24"/>
+          <w:szCs w:val="24"/>
+        </w:rPr>
+        <w:t xml:space="preserve"> }} </w:t>
       </w:r>
       <w:r>
         <w:rPr>
@@ -468,6 +499,7 @@
         </w:rPr>
         <w:t xml:space="preserve">bulan </w:t>
       </w:r>
+      <w:proofErr w:type="gramStart"/>
       <w:r>
         <w:rPr>
           <w:rFonts w:ascii="Times New Roman" w:eastAsia="Times New Roman" w:hAnsi="Times New Roman"/>
@@ -476,12 +508,23 @@
           <w:sz w:val="24"/>
           <w:szCs w:val="24"/>
         </w:rPr>
-        <w:t>{{ bulan }}</w:t>
-      </w:r>
+        <w:t>{{ bulan</w:t>
+      </w:r>
+      <w:proofErr w:type="gramEnd"/>
       <w:r>
         <w:rPr>
           <w:rFonts w:ascii="Times New Roman" w:eastAsia="Times New Roman" w:hAnsi="Times New Roman"/>
           <w:i/>
+          <w:iCs/>
+          <w:sz w:val="24"/>
+          <w:szCs w:val="24"/>
+        </w:rPr>
+        <w:t xml:space="preserve"> }}</w:t>
+      </w:r>
+      <w:r>
+        <w:rPr>
+          <w:rFonts w:ascii="Times New Roman" w:eastAsia="Times New Roman" w:hAnsi="Times New Roman"/>
+          <w:i/>
           <w:sz w:val="24"/>
           <w:szCs w:val="24"/>
         </w:rPr>
@@ -520,8 +563,18 @@
           <w:sz w:val="24"/>
           <w:szCs w:val="24"/>
         </w:rPr>
-        <w:t>Maka yang bertanda tangan di bawah ini :</w:t>
-      </w:r>
+        <w:t xml:space="preserve">Maka yang bertanda tangan di bawah </w:t>
+      </w:r>
+      <w:proofErr w:type="gramStart"/>
+      <w:r>
+        <w:rPr>
+          <w:rFonts w:ascii="Times New Roman" w:eastAsia="Times New Roman" w:hAnsi="Times New Roman"/>
+          <w:sz w:val="24"/>
+          <w:szCs w:val="24"/>
+        </w:rPr>
+        <w:t>ini :</w:t>
+      </w:r>
+      <w:proofErr w:type="gramEnd"/>
     </w:p>
     <w:p>
       <w:pPr>
@@ -578,8 +631,9 @@
           <w:szCs w:val="24"/>
           <w:lang w:val="en-US"/>
         </w:rPr>
-        <w:t>R. TRIYONO PUTRO, SH, M.S</w:t>
-      </w:r>
+        <w:t xml:space="preserve">R. TRIYONO PUTRO, SH, </w:t>
+      </w:r>
+      <w:proofErr w:type="gramStart"/>
       <w:r>
         <w:rPr>
           <w:rFonts w:ascii="Times New Roman" w:eastAsia="Times New Roman" w:hAnsi="Times New Roman"/>
@@ -587,9 +641,21 @@
           <w:bCs/>
           <w:sz w:val="24"/>
           <w:szCs w:val="24"/>
+          <w:lang w:val="en-US"/>
+        </w:rPr>
+        <w:t>M.S</w:t>
+      </w:r>
+      <w:r>
+        <w:rPr>
+          <w:rFonts w:ascii="Times New Roman" w:eastAsia="Times New Roman" w:hAnsi="Times New Roman"/>
+          <w:b/>
+          <w:bCs/>
+          <w:sz w:val="24"/>
+          <w:szCs w:val="24"/>
         </w:rPr>
         <w:t>i</w:t>
       </w:r>
+      <w:proofErr w:type="gramEnd"/>
     </w:p>
     <w:p>
       <w:pPr>
@@ -889,7 +955,7 @@
           <w:sz w:val="24"/>
           <w:szCs w:val="24"/>
         </w:rPr>
-        <w:t xml:space="preserve">untuk dipergunakan sebagai Bantuan Logistik untuk Santunan Korban {{ bencana }} di {{ alamat }}, Kab. Sragen. </w:t>
+        <w:t xml:space="preserve">untuk dipergunakan sebagai Bantuan Logistik untuk {{ bencana }} di {{ alamat }}, Kab. Sragen. </w:t>
       </w:r>
       <w:r>
         <w:rPr>
@@ -1641,8 +1707,9 @@
           <w:u w:val="single"/>
           <w:lang w:val="en-US"/>
         </w:rPr>
-        <w:t>R. TRIYONO PUTRO, SH, M.S</w:t>
-      </w:r>
+        <w:t xml:space="preserve">R. TRIYONO PUTRO, SH, </w:t>
+      </w:r>
+      <w:proofErr w:type="gramStart"/>
       <w:r>
         <w:rPr>
           <w:rFonts w:ascii="Times New Roman" w:eastAsia="Times New Roman" w:hAnsi="Times New Roman"/>
@@ -1651,9 +1718,22 @@
           <w:sz w:val="24"/>
           <w:szCs w:val="24"/>
           <w:u w:val="single"/>
+          <w:lang w:val="en-US"/>
+        </w:rPr>
+        <w:t>M.S</w:t>
+      </w:r>
+      <w:r>
+        <w:rPr>
+          <w:rFonts w:ascii="Times New Roman" w:eastAsia="Times New Roman" w:hAnsi="Times New Roman"/>
+          <w:b/>
+          <w:bCs/>
+          <w:sz w:val="24"/>
+          <w:szCs w:val="24"/>
+          <w:u w:val="single"/>
         </w:rPr>
         <w:t>i</w:t>
       </w:r>
+      <w:proofErr w:type="gramEnd"/>
     </w:p>
     <w:p>
       <w:pPr>

</xml_diff>